<commit_message>
docs: pgy3 icu reduction and procedural supervision addition
</commit_message>
<xml_diff>
--- a/Docs/MHS_Curriculum_Proposal.docx
+++ b/Docs/MHS_Curriculum_Proposal.docx
@@ -1567,7 +1567,7 @@
           <w:spacing w:val="0"/>
           <w:color w:val="262626"/>
         </w:rPr>
-        <w:t xml:space="preserve">2</w:t>
+        <w:t xml:space="preserve">1</w:t>
       </w:r>
       <w:r>
         <w:rPr>
@@ -1615,6 +1615,69 @@
           <w:color w:val="262626"/>
         </w:rPr>
         <w:t xml:space="preserve">ICU Main or ICU Metro (Resident's Choice)</w:t>
+      </w:r>
+    </w:p>
+    <w:p>
+      <w:pPr>
+        <w:jc w:val="center"/>
+      </w:pPr>
+      <w:r>
+        <w:rPr>
+          <w:rFonts w:ascii="Helvetica Neue" w:hAnsi="Helvetica Neue" w:cs="Helvetica Neue"/>
+          <w:sz w:val="24"/>
+          <w:sz-cs w:val="24"/>
+          <w:b/>
+          <w:spacing w:val="0"/>
+          <w:color w:val="262626"/>
+        </w:rPr>
+        <w:t xml:space="preserve">1</w:t>
+      </w:r>
+      <w:r>
+        <w:rPr>
+          <w:rFonts w:ascii="Helvetica Neue" w:hAnsi="Helvetica Neue" w:cs="Helvetica Neue"/>
+          <w:sz w:val="24"/>
+          <w:sz-cs w:val="24"/>
+          <w:spacing w:val="0"/>
+          <w:color w:val="262626"/>
+        </w:rPr>
+        <w:t xml:space="preserve"/>
+      </w:r>
+    </w:p>
+    <w:p>
+      <w:pPr/>
+      <w:r>
+        <w:rPr>
+          <w:rFonts w:ascii="Helvetica Neue" w:hAnsi="Helvetica Neue" w:cs="Helvetica Neue"/>
+          <w:sz w:val="24"/>
+          <w:sz-cs w:val="24"/>
+          <w:b/>
+          <w:spacing w:val="0"/>
+          <w:color w:val="262626"/>
+        </w:rPr>
+        <w:t xml:space="preserve">Split: Cardiology / Procedural</w:t>
+      </w:r>
+      <w:r>
+        <w:rPr>
+          <w:rFonts w:ascii="Helvetica Neue" w:hAnsi="Helvetica Neue" w:cs="Helvetica Neue"/>
+          <w:sz w:val="24"/>
+          <w:sz-cs w:val="24"/>
+          <w:spacing w:val="0"/>
+          <w:color w:val="262626"/>
+        </w:rPr>
+        <w:t xml:space="preserve"/>
+      </w:r>
+    </w:p>
+    <w:p>
+      <w:pPr/>
+      <w:r>
+        <w:rPr>
+          <w:rFonts w:ascii="Helvetica Neue" w:hAnsi="Helvetica Neue" w:cs="Helvetica Neue"/>
+          <w:sz w:val="24"/>
+          <w:sz-cs w:val="24"/>
+          <w:spacing w:val="0"/>
+          <w:color w:val="262626"/>
+        </w:rPr>
+        <w:t xml:space="preserve">2 weeks Cardiology (Consults/Clinic) + 2 weeks Procedural Supervision (Overseeing PGY-1s on Pulm/ICU)</w:t>
       </w:r>
     </w:p>
     <w:p>
@@ -2660,7 +2723,7 @@
           <w:spacing w:val="0"/>
           <w:color w:val="262626"/>
         </w:rPr>
-        <w:t xml:space="preserve">: 5 months exact (PGY1 = 2, PGY2 = 1, PGY3 = 2). </w:t>
+        <w:t xml:space="preserve">: 4 months exact (PGY1 = 2, PGY2 = 1, PGY3 = 1). </w:t>
       </w:r>
       <w:r>
         <w:rPr>

</xml_diff>

<commit_message>
fix: add blank lines before bullet lists so HTML renders proper list elements
</commit_message>
<xml_diff>
--- a/Docs/MHS_Curriculum_Proposal.docx
+++ b/Docs/MHS_Curriculum_Proposal.docx
@@ -51,7 +51,26 @@
           <w:spacing w:val="0"/>
           <w:color w:val="262626"/>
         </w:rPr>
-        <w:t xml:space="preserve"> alternating block model. In this structure, the academic year consists of ten 5-week cycles per year. For each cycle, residents spend 4 weeks on a core rotation, followed immediately by 1 week dedicated entirely to continuity clinic. * </w:t>
+        <w:t xml:space="preserve"> alternating block model. In this structure, the academic year consists of ten 5-week cycles per year. For each cycle, residents spend 4 weeks on a core rotation, followed immediately by 1 week dedicated entirely to continuity clinic.</w:t>
+      </w:r>
+    </w:p>
+    <w:p>
+      <w:pPr>
+        <w:ind w:left="720" w:first-line="-720"/>
+      </w:pPr>
+      <w:r>
+        <w:rPr>
+          <w:rFonts w:ascii="Helvetica Neue" w:hAnsi="Helvetica Neue" w:cs="Helvetica Neue"/>
+          <w:sz w:val="24"/>
+          <w:sz-cs w:val="24"/>
+          <w:b/>
+          <w:color w:val="262626"/>
+        </w:rPr>
+        <w:t xml:space="preserve"/>
+        <w:tab/>
+        <w:t xml:space="preserve">•</w:t>
+        <w:tab/>
+        <w:t xml:space="preserve"/>
       </w:r>
       <w:r>
         <w:rPr>
@@ -72,7 +91,26 @@
           <w:spacing w:val="0"/>
           <w:color w:val="262626"/>
         </w:rPr>
-        <w:t xml:space="preserve"> 10 core blocks (40 weeks) + 10 clinic weeks (10 weeks) + 2 weeks standard vacation/holiday = 52 weeks. * </w:t>
+        <w:t xml:space="preserve"> 10 core blocks (40 weeks) + 10 clinic weeks (10 weeks) + 2 weeks standard vacation/holiday = 52 weeks.</w:t>
+      </w:r>
+    </w:p>
+    <w:p>
+      <w:pPr>
+        <w:ind w:left="720" w:first-line="-720"/>
+      </w:pPr>
+      <w:r>
+        <w:rPr>
+          <w:rFonts w:ascii="Helvetica Neue" w:hAnsi="Helvetica Neue" w:cs="Helvetica Neue"/>
+          <w:sz w:val="24"/>
+          <w:sz-cs w:val="24"/>
+          <w:b/>
+          <w:color w:val="262626"/>
+        </w:rPr>
+        <w:t xml:space="preserve"/>
+        <w:tab/>
+        <w:t xml:space="preserve">•</w:t>
+        <w:tab/>
+        <w:t xml:space="preserve"/>
       </w:r>
       <w:r>
         <w:rPr>
@@ -2099,7 +2137,26 @@
           <w:spacing w:val="0"/>
           <w:color w:val="262626"/>
         </w:rPr>
-        <w:t xml:space="preserve">To maintain the required 4+1 structure and preserve inpatient caps without compromising continuity clinics or mandatory subspecialty blocks, Jeopardy coverage is strictly defined to utilize residents on flexible time, guaranteeing continuous year-round availability. Interns are explicitly protected from Jeopardy pulls. * </w:t>
+        <w:t xml:space="preserve">To maintain the required 4+1 structure and preserve inpatient caps without compromising continuity clinics or mandatory subspecialty blocks, Jeopardy coverage is strictly defined to utilize residents on flexible time, guaranteeing continuous year-round availability. Interns are explicitly protected from Jeopardy pulls.</w:t>
+      </w:r>
+    </w:p>
+    <w:p>
+      <w:pPr>
+        <w:ind w:left="720" w:first-line="-720"/>
+      </w:pPr>
+      <w:r>
+        <w:rPr>
+          <w:rFonts w:ascii="Helvetica Neue" w:hAnsi="Helvetica Neue" w:cs="Helvetica Neue"/>
+          <w:sz w:val="24"/>
+          <w:sz-cs w:val="24"/>
+          <w:b/>
+          <w:color w:val="262626"/>
+        </w:rPr>
+        <w:t xml:space="preserve"/>
+        <w:tab/>
+        <w:t xml:space="preserve">•</w:t>
+        <w:tab/>
+        <w:t xml:space="preserve"/>
       </w:r>
       <w:r>
         <w:rPr>
@@ -2120,7 +2177,26 @@
           <w:spacing w:val="0"/>
           <w:color w:val="262626"/>
         </w:rPr>
-        <w:t xml:space="preserve"> If an intern calls out, Attendings or Seniors will pick up the patient volume directly. * </w:t>
+        <w:t xml:space="preserve"> If an intern calls out, Attendings or Seniors will pick up the patient volume directly.</w:t>
+      </w:r>
+    </w:p>
+    <w:p>
+      <w:pPr>
+        <w:ind w:left="720" w:first-line="-720"/>
+      </w:pPr>
+      <w:r>
+        <w:rPr>
+          <w:rFonts w:ascii="Helvetica Neue" w:hAnsi="Helvetica Neue" w:cs="Helvetica Neue"/>
+          <w:sz w:val="24"/>
+          <w:sz-cs w:val="24"/>
+          <w:b/>
+          <w:color w:val="262626"/>
+        </w:rPr>
+        <w:t xml:space="preserve"/>
+        <w:tab/>
+        <w:t xml:space="preserve">•</w:t>
+        <w:tab/>
+        <w:t xml:space="preserve"/>
       </w:r>
       <w:r>
         <w:rPr>
@@ -2183,7 +2259,26 @@
           <w:spacing w:val="0"/>
           <w:color w:val="262626"/>
         </w:rPr>
-        <w:t xml:space="preserve"> block. * </w:t>
+        <w:t xml:space="preserve"> block.</w:t>
+      </w:r>
+    </w:p>
+    <w:p>
+      <w:pPr>
+        <w:ind w:left="720" w:first-line="-720"/>
+      </w:pPr>
+      <w:r>
+        <w:rPr>
+          <w:rFonts w:ascii="Helvetica Neue" w:hAnsi="Helvetica Neue" w:cs="Helvetica Neue"/>
+          <w:sz w:val="24"/>
+          <w:sz-cs w:val="24"/>
+          <w:b/>
+          <w:color w:val="262626"/>
+        </w:rPr>
+        <w:t xml:space="preserve"/>
+        <w:tab/>
+        <w:t xml:space="preserve">•</w:t>
+        <w:tab/>
+        <w:t xml:space="preserve"/>
       </w:r>
       <w:r>
         <w:rPr>
@@ -2246,7 +2341,26 @@
           <w:spacing w:val="0"/>
           <w:color w:val="262626"/>
         </w:rPr>
-        <w:t xml:space="preserve"> block will be pulled. * </w:t>
+        <w:t xml:space="preserve"> block will be pulled.</w:t>
+      </w:r>
+    </w:p>
+    <w:p>
+      <w:pPr>
+        <w:ind w:left="720" w:first-line="-720"/>
+      </w:pPr>
+      <w:r>
+        <w:rPr>
+          <w:rFonts w:ascii="Helvetica Neue" w:hAnsi="Helvetica Neue" w:cs="Helvetica Neue"/>
+          <w:sz w:val="24"/>
+          <w:sz-cs w:val="24"/>
+          <w:b/>
+          <w:color w:val="262626"/>
+        </w:rPr>
+        <w:t xml:space="preserve"/>
+        <w:tab/>
+        <w:t xml:space="preserve">•</w:t>
+        <w:tab/>
+        <w:t xml:space="preserve"/>
       </w:r>
       <w:r>
         <w:rPr>
@@ -2311,7 +2425,26 @@
           <w:spacing w:val="0"/>
           <w:color w:val="262626"/>
         </w:rPr>
-        <w:t xml:space="preserve">To ensure compliance with the program's explicit Time Away Request rules and protect the 4+1 patient continuity rhythm, the scheduling engine and block assignments must reflect the following constraints: * </w:t>
+        <w:t xml:space="preserve">To ensure compliance with the program's explicit Time Away Request rules and protect the 4+1 patient continuity rhythm, the scheduling engine and block assignments must reflect the following constraints:</w:t>
+      </w:r>
+    </w:p>
+    <w:p>
+      <w:pPr>
+        <w:ind w:left="720" w:first-line="-720"/>
+      </w:pPr>
+      <w:r>
+        <w:rPr>
+          <w:rFonts w:ascii="Helvetica Neue" w:hAnsi="Helvetica Neue" w:cs="Helvetica Neue"/>
+          <w:sz w:val="24"/>
+          <w:sz-cs w:val="24"/>
+          <w:b/>
+          <w:color w:val="262626"/>
+        </w:rPr>
+        <w:t xml:space="preserve"/>
+        <w:tab/>
+        <w:t xml:space="preserve">•</w:t>
+        <w:tab/>
+        <w:t xml:space="preserve"/>
       </w:r>
       <w:r>
         <w:rPr>
@@ -2353,7 +2486,26 @@
           <w:spacing w:val="0"/>
           <w:color w:val="262626"/>
         </w:rPr>
-        <w:t xml:space="preserve"> during Wards, ICU, and the "+1" CCIM/NIMA continuity clinic blocks. Vacations must be requested and mapped exclusively out of flexible Elective or Consult blocks. * </w:t>
+        <w:t xml:space="preserve"> during Wards, ICU, and the "+1" CCIM/NIMA continuity clinic blocks. Vacations must be requested and mapped exclusively out of flexible Elective or Consult blocks.</w:t>
+      </w:r>
+    </w:p>
+    <w:p>
+      <w:pPr>
+        <w:ind w:left="720" w:first-line="-720"/>
+      </w:pPr>
+      <w:r>
+        <w:rPr>
+          <w:rFonts w:ascii="Helvetica Neue" w:hAnsi="Helvetica Neue" w:cs="Helvetica Neue"/>
+          <w:sz w:val="24"/>
+          <w:sz-cs w:val="24"/>
+          <w:b/>
+          <w:color w:val="262626"/>
+        </w:rPr>
+        <w:t xml:space="preserve"/>
+        <w:tab/>
+        <w:t xml:space="preserve">•</w:t>
+        <w:tab/>
+        <w:t xml:space="preserve"/>
       </w:r>
       <w:r>
         <w:rPr>
@@ -2416,7 +2568,26 @@
           <w:spacing w:val="0"/>
           <w:color w:val="262626"/>
         </w:rPr>
-        <w:t xml:space="preserve">. * </w:t>
+        <w:t xml:space="preserve">.</w:t>
+      </w:r>
+    </w:p>
+    <w:p>
+      <w:pPr>
+        <w:ind w:left="720" w:first-line="-720"/>
+      </w:pPr>
+      <w:r>
+        <w:rPr>
+          <w:rFonts w:ascii="Helvetica Neue" w:hAnsi="Helvetica Neue" w:cs="Helvetica Neue"/>
+          <w:sz w:val="24"/>
+          <w:sz-cs w:val="24"/>
+          <w:b/>
+          <w:color w:val="262626"/>
+        </w:rPr>
+        <w:t xml:space="preserve"/>
+        <w:tab/>
+        <w:t xml:space="preserve">•</w:t>
+        <w:tab/>
+        <w:t xml:space="preserve"/>
       </w:r>
       <w:r>
         <w:rPr>
@@ -2437,7 +2608,26 @@
           <w:spacing w:val="0"/>
           <w:color w:val="262626"/>
         </w:rPr>
-        <w:t xml:space="preserve"> Vacation time must be taken on consecutive days bridged to a weekend (weekends are counted as regular days off, not PTO). Coverage requests require minimum 60-day notice. * </w:t>
+        <w:t xml:space="preserve"> Vacation time must be taken on consecutive days bridged to a weekend (weekends are counted as regular days off, not PTO). Coverage requests require minimum 60-day notice.</w:t>
+      </w:r>
+    </w:p>
+    <w:p>
+      <w:pPr>
+        <w:ind w:left="720" w:first-line="-720"/>
+      </w:pPr>
+      <w:r>
+        <w:rPr>
+          <w:rFonts w:ascii="Helvetica Neue" w:hAnsi="Helvetica Neue" w:cs="Helvetica Neue"/>
+          <w:sz w:val="24"/>
+          <w:sz-cs w:val="24"/>
+          <w:b/>
+          <w:color w:val="262626"/>
+        </w:rPr>
+        <w:t xml:space="preserve"/>
+        <w:tab/>
+        <w:t xml:space="preserve">•</w:t>
+        <w:tab/>
+        <w:t xml:space="preserve"/>
       </w:r>
       <w:r>
         <w:rPr>
@@ -2510,7 +2700,26 @@
           <w:spacing w:val="0"/>
           <w:color w:val="262626"/>
         </w:rPr>
-        <w:t xml:space="preserve"> rotation (e.g., Mandatory Geriatrics, Split Neurology), the scheduling engine will enforce the following deficit recovery rules: * </w:t>
+        <w:t xml:space="preserve"> rotation (e.g., Mandatory Geriatrics, Split Neurology), the scheduling engine will enforce the following deficit recovery rules:</w:t>
+      </w:r>
+    </w:p>
+    <w:p>
+      <w:pPr>
+        <w:ind w:left="720" w:first-line="-720"/>
+      </w:pPr>
+      <w:r>
+        <w:rPr>
+          <w:rFonts w:ascii="Helvetica Neue" w:hAnsi="Helvetica Neue" w:cs="Helvetica Neue"/>
+          <w:sz w:val="24"/>
+          <w:sz-cs w:val="24"/>
+          <w:b/>
+          <w:color w:val="262626"/>
+        </w:rPr>
+        <w:t xml:space="preserve"/>
+        <w:tab/>
+        <w:t xml:space="preserve">•</w:t>
+        <w:tab/>
+        <w:t xml:space="preserve"/>
       </w:r>
       <w:r>
         <w:rPr>
@@ -2531,7 +2740,26 @@
           <w:spacing w:val="0"/>
           <w:color w:val="262626"/>
         </w:rPr>
-        <w:t xml:space="preserve"> If a resident takes 1 week of PTO during a 4-week mandatory block, the system does not force a makeup. Completing 3 of 4 weeks satisfies competency exposure minimums. * </w:t>
+        <w:t xml:space="preserve"> If a resident takes 1 week of PTO during a 4-week mandatory block, the system does not force a makeup. Completing 3 of 4 weeks satisfies competency exposure minimums.</w:t>
+      </w:r>
+    </w:p>
+    <w:p>
+      <w:pPr>
+        <w:ind w:left="720" w:first-line="-720"/>
+      </w:pPr>
+      <w:r>
+        <w:rPr>
+          <w:rFonts w:ascii="Helvetica Neue" w:hAnsi="Helvetica Neue" w:cs="Helvetica Neue"/>
+          <w:sz w:val="24"/>
+          <w:sz-cs w:val="24"/>
+          <w:b/>
+          <w:color w:val="262626"/>
+        </w:rPr>
+        <w:t xml:space="preserve"/>
+        <w:tab/>
+        <w:t xml:space="preserve">•</w:t>
+        <w:tab/>
+        <w:t xml:space="preserve"/>
       </w:r>
       <w:r>
         <w:rPr>
@@ -2573,7 +2801,26 @@
           <w:spacing w:val="0"/>
           <w:color w:val="262626"/>
         </w:rPr>
-        <w:t xml:space="preserve">. The algorithm will then identify the resident's next "Pure Elective" block and automatically overwrite the necessary weeks to recuperate the mandated exposure. * </w:t>
+        <w:t xml:space="preserve">. The algorithm will then identify the resident's next "Pure Elective" block and automatically overwrite the necessary weeks to recuperate the mandated exposure.</w:t>
+      </w:r>
+    </w:p>
+    <w:p>
+      <w:pPr>
+        <w:ind w:left="720" w:first-line="-720"/>
+      </w:pPr>
+      <w:r>
+        <w:rPr>
+          <w:rFonts w:ascii="Helvetica Neue" w:hAnsi="Helvetica Neue" w:cs="Helvetica Neue"/>
+          <w:sz w:val="24"/>
+          <w:sz-cs w:val="24"/>
+          <w:b/>
+          <w:color w:val="262626"/>
+        </w:rPr>
+        <w:t xml:space="preserve"/>
+        <w:tab/>
+        <w:t xml:space="preserve">•</w:t>
+        <w:tab/>
+        <w:t xml:space="preserve"/>
       </w:r>
       <w:r>
         <w:rPr>

</xml_diff>